<commit_message>
feat: offline fallback when the LLM is unavailable
Local stylometric attacker, connector-based structuring and keyword themes keep the
demo working when the LLM endpoint fails (e.g. budget exhausted). Steps that used a
fallback are labelled in the trace and /api/health reports llm_available. The entry
form mentions the fallback.

Co-Authored-By: Claude Opus 5.5 <noreply@anthropic.com>
</commit_message>
<xml_diff>
--- a/docs/submission/Entry_Form_KrengjaiBridge.docx
+++ b/docs/submission/Entry_Form_KrengjaiBridge.docx
@@ -2375,6 +2375,20 @@
                 <w:sz w:val="24"/>
               </w:rPr>
               <w:t xml:space="preserve"> on the ECS and fixed in the deploy script.</w:t>
+            </w:r>
+          </w:p>
+          <w:p>
+            <w:pPr>
+              <w:widowControl/>
+              <w:spacing w:after="120" w:line="245" w:lineRule="auto"/>
+            </w:pPr>
+            <w:r>
+              <w:rPr>
+                <w:rFonts w:ascii="Arial" w:hAnsi="Arial" w:eastAsia="Leelawadee UI" w:cs="Leelawadee UI"/>
+                <w:b w:val="0"/>
+                <w:sz w:val="24"/>
+              </w:rPr>
+              <w:t>The shared LLM key reached its budget during evaluation. We added an offline fallback (roster scrub + PyThaiNLP, a local stylometric attacker, rule-based structuring and themes), labelled in the UI, so the demo degrades instead of failing.</w:t>
             </w:r>
           </w:p>
           <w:p>

</xml_diff>

<commit_message>
feat: typed LINE commands, Ollama native API, LINE setup and recording guides
- LINE for PC/Mac has no quick replies: typed names link a persona, typed button labels
  answer the latest nudge, and ยืนยัน/ยกเลิก finish the latest draft. Short non-command
  text asks for detail instead of running the pipeline.
- Quick replies and Flex buttons echo the choice into the chat (displayText).
- llm.py talks to Ollama's /api/chat with think=false when LLM_API_STYLE=ollama or the
  base URL uses port 11434.
- docs/submission/LINE_SETUP.md walks through the LINE console, including the typed
  commands. scripts/record_demo.py records the web walkthrough with captions
  (docs/RECORDING.md). The entry form has the confirmed student names.

Co-Authored-By: Claude Opus 5.5 <noreply@anthropic.com>
</commit_message>
<xml_diff>
--- a/docs/submission/Entry_Form_KrengjaiBridge.docx
+++ b/docs/submission/Entry_Form_KrengjaiBridge.docx
@@ -583,48 +583,42 @@
             </w:pPr>
             <w:r>
               <w:rPr>
+                <w:rFonts w:ascii="Leelawadee UI" w:hAnsi="Leelawadee UI" w:eastAsia="Leelawadee UI" w:cs="Leelawadee UI"/>
+                <w:b w:val="0"/>
+                <w:sz w:val="24"/>
+              </w:rPr>
+              <w:t>กฤษฎา</w:t>
+            </w:r>
+            <w:r>
+              <w:rPr>
+                <w:rFonts w:ascii="Arial" w:hAnsi="Arial" w:eastAsia="Leelawadee UI" w:cs="Leelawadee UI"/>
+                <w:b w:val="0"/>
+                <w:sz w:val="24"/>
+              </w:rPr>
+              <w:t xml:space="preserve"> </w:t>
+            </w:r>
+            <w:r>
+              <w:rPr>
+                <w:rFonts w:ascii="Leelawadee UI" w:hAnsi="Leelawadee UI" w:eastAsia="Leelawadee UI" w:cs="Leelawadee UI"/>
+                <w:b w:val="0"/>
+                <w:sz w:val="24"/>
+              </w:rPr>
+              <w:t>ลิ้มศรีประพันธ์</w:t>
+            </w:r>
+          </w:p>
+          <w:p>
+            <w:pPr>
+              <w:widowControl/>
+              <w:spacing w:after="120" w:line="245" w:lineRule="auto"/>
+            </w:pPr>
+            <w:r>
+              <w:rPr>
                 <w:rFonts w:ascii="Arial" w:hAnsi="Arial" w:eastAsia="Leelawadee UI" w:cs="Leelawadee UI"/>
                 <w:b w:val="0"/>
                 <w:sz w:val="24"/>
                 <w:highlight w:val="yellow"/>
               </w:rPr>
-              <w:t xml:space="preserve">[[TODO: confirm — </w:t>
-            </w:r>
-            <w:r>
-              <w:rPr>
-                <w:rFonts w:ascii="Leelawadee UI" w:hAnsi="Leelawadee UI" w:eastAsia="Leelawadee UI" w:cs="Leelawadee UI"/>
-                <w:b w:val="0"/>
-                <w:sz w:val="24"/>
-                <w:highlight w:val="yellow"/>
-              </w:rPr>
-              <w:t>กฤษฎา</w:t>
-            </w:r>
-            <w:r>
-              <w:rPr>
-                <w:rFonts w:ascii="Arial" w:hAnsi="Arial" w:eastAsia="Leelawadee UI" w:cs="Leelawadee UI"/>
-                <w:b w:val="0"/>
-                <w:sz w:val="24"/>
-                <w:highlight w:val="yellow"/>
-              </w:rPr>
-              <w:t xml:space="preserve"> </w:t>
-            </w:r>
-            <w:r>
-              <w:rPr>
-                <w:rFonts w:ascii="Leelawadee UI" w:hAnsi="Leelawadee UI" w:eastAsia="Leelawadee UI" w:cs="Leelawadee UI"/>
-                <w:b w:val="0"/>
-                <w:sz w:val="24"/>
-                <w:highlight w:val="yellow"/>
-              </w:rPr>
-              <w:t>ลิ้มศรีประพันธ์</w:t>
-            </w:r>
-            <w:r>
-              <w:rPr>
-                <w:rFonts w:ascii="Arial" w:hAnsi="Arial" w:eastAsia="Leelawadee UI" w:cs="Leelawadee UI"/>
-                <w:b w:val="0"/>
-                <w:sz w:val="24"/>
-                <w:highlight w:val="yellow"/>
-              </w:rPr>
-              <w:t>; add English name]]</w:t>
+              <w:t>[[TODO: English name]]</w:t>
             </w:r>
           </w:p>
         </w:tc>
@@ -650,48 +644,42 @@
             </w:pPr>
             <w:r>
               <w:rPr>
+                <w:rFonts w:ascii="Leelawadee UI" w:hAnsi="Leelawadee UI" w:eastAsia="Leelawadee UI" w:cs="Leelawadee UI"/>
+                <w:b w:val="0"/>
+                <w:sz w:val="24"/>
+              </w:rPr>
+              <w:t>ชิติพัฒน์</w:t>
+            </w:r>
+            <w:r>
+              <w:rPr>
+                <w:rFonts w:ascii="Arial" w:hAnsi="Arial" w:eastAsia="Leelawadee UI" w:cs="Leelawadee UI"/>
+                <w:b w:val="0"/>
+                <w:sz w:val="24"/>
+              </w:rPr>
+              <w:t xml:space="preserve"> </w:t>
+            </w:r>
+            <w:r>
+              <w:rPr>
+                <w:rFonts w:ascii="Leelawadee UI" w:hAnsi="Leelawadee UI" w:eastAsia="Leelawadee UI" w:cs="Leelawadee UI"/>
+                <w:b w:val="0"/>
+                <w:sz w:val="24"/>
+              </w:rPr>
+              <w:t>ภู่ทอง</w:t>
+            </w:r>
+          </w:p>
+          <w:p>
+            <w:pPr>
+              <w:widowControl/>
+              <w:spacing w:after="120" w:line="245" w:lineRule="auto"/>
+            </w:pPr>
+            <w:r>
+              <w:rPr>
                 <w:rFonts w:ascii="Arial" w:hAnsi="Arial" w:eastAsia="Leelawadee UI" w:cs="Leelawadee UI"/>
                 <w:b w:val="0"/>
                 <w:sz w:val="24"/>
                 <w:highlight w:val="yellow"/>
               </w:rPr>
-              <w:t xml:space="preserve">[[TODO: confirm — </w:t>
-            </w:r>
-            <w:r>
-              <w:rPr>
-                <w:rFonts w:ascii="Leelawadee UI" w:hAnsi="Leelawadee UI" w:eastAsia="Leelawadee UI" w:cs="Leelawadee UI"/>
-                <w:b w:val="0"/>
-                <w:sz w:val="24"/>
-                <w:highlight w:val="yellow"/>
-              </w:rPr>
-              <w:t>ชิติพัฒน์</w:t>
-            </w:r>
-            <w:r>
-              <w:rPr>
-                <w:rFonts w:ascii="Arial" w:hAnsi="Arial" w:eastAsia="Leelawadee UI" w:cs="Leelawadee UI"/>
-                <w:b w:val="0"/>
-                <w:sz w:val="24"/>
-                <w:highlight w:val="yellow"/>
-              </w:rPr>
-              <w:t xml:space="preserve"> </w:t>
-            </w:r>
-            <w:r>
-              <w:rPr>
-                <w:rFonts w:ascii="Leelawadee UI" w:hAnsi="Leelawadee UI" w:eastAsia="Leelawadee UI" w:cs="Leelawadee UI"/>
-                <w:b w:val="0"/>
-                <w:sz w:val="24"/>
-                <w:highlight w:val="yellow"/>
-              </w:rPr>
-              <w:t>ภู่ทอง</w:t>
-            </w:r>
-            <w:r>
-              <w:rPr>
-                <w:rFonts w:ascii="Arial" w:hAnsi="Arial" w:eastAsia="Leelawadee UI" w:cs="Leelawadee UI"/>
-                <w:b w:val="0"/>
-                <w:sz w:val="24"/>
-                <w:highlight w:val="yellow"/>
-              </w:rPr>
-              <w:t>; add English name]]</w:t>
+              <w:t>[[TODO: English name]]</w:t>
             </w:r>
           </w:p>
         </w:tc>
@@ -720,48 +708,42 @@
             </w:pPr>
             <w:r>
               <w:rPr>
+                <w:rFonts w:ascii="Leelawadee UI" w:hAnsi="Leelawadee UI" w:eastAsia="Leelawadee UI" w:cs="Leelawadee UI"/>
+                <w:b w:val="0"/>
+                <w:sz w:val="24"/>
+              </w:rPr>
+              <w:t>ภาณุพงษ์</w:t>
+            </w:r>
+            <w:r>
+              <w:rPr>
+                <w:rFonts w:ascii="Arial" w:hAnsi="Arial" w:eastAsia="Leelawadee UI" w:cs="Leelawadee UI"/>
+                <w:b w:val="0"/>
+                <w:sz w:val="24"/>
+              </w:rPr>
+              <w:t xml:space="preserve"> </w:t>
+            </w:r>
+            <w:r>
+              <w:rPr>
+                <w:rFonts w:ascii="Leelawadee UI" w:hAnsi="Leelawadee UI" w:eastAsia="Leelawadee UI" w:cs="Leelawadee UI"/>
+                <w:b w:val="0"/>
+                <w:sz w:val="24"/>
+              </w:rPr>
+              <w:t>สภานนท์</w:t>
+            </w:r>
+          </w:p>
+          <w:p>
+            <w:pPr>
+              <w:widowControl/>
+              <w:spacing w:after="120" w:line="245" w:lineRule="auto"/>
+            </w:pPr>
+            <w:r>
+              <w:rPr>
                 <w:rFonts w:ascii="Arial" w:hAnsi="Arial" w:eastAsia="Leelawadee UI" w:cs="Leelawadee UI"/>
                 <w:b w:val="0"/>
                 <w:sz w:val="24"/>
                 <w:highlight w:val="yellow"/>
               </w:rPr>
-              <w:t xml:space="preserve">[[TODO: confirm — </w:t>
-            </w:r>
-            <w:r>
-              <w:rPr>
-                <w:rFonts w:ascii="Leelawadee UI" w:hAnsi="Leelawadee UI" w:eastAsia="Leelawadee UI" w:cs="Leelawadee UI"/>
-                <w:b w:val="0"/>
-                <w:sz w:val="24"/>
-                <w:highlight w:val="yellow"/>
-              </w:rPr>
-              <w:t>ภาณุพงษ์</w:t>
-            </w:r>
-            <w:r>
-              <w:rPr>
-                <w:rFonts w:ascii="Arial" w:hAnsi="Arial" w:eastAsia="Leelawadee UI" w:cs="Leelawadee UI"/>
-                <w:b w:val="0"/>
-                <w:sz w:val="24"/>
-                <w:highlight w:val="yellow"/>
-              </w:rPr>
-              <w:t xml:space="preserve"> </w:t>
-            </w:r>
-            <w:r>
-              <w:rPr>
-                <w:rFonts w:ascii="Leelawadee UI" w:hAnsi="Leelawadee UI" w:eastAsia="Leelawadee UI" w:cs="Leelawadee UI"/>
-                <w:b w:val="0"/>
-                <w:sz w:val="24"/>
-                <w:highlight w:val="yellow"/>
-              </w:rPr>
-              <w:t>สภานนท์</w:t>
-            </w:r>
-            <w:r>
-              <w:rPr>
-                <w:rFonts w:ascii="Arial" w:hAnsi="Arial" w:eastAsia="Leelawadee UI" w:cs="Leelawadee UI"/>
-                <w:b w:val="0"/>
-                <w:sz w:val="24"/>
-                <w:highlight w:val="yellow"/>
-              </w:rPr>
-              <w:t>; add English name]]</w:t>
+              <w:t>[[TODO: English name]]</w:t>
             </w:r>
           </w:p>
         </w:tc>
@@ -3606,16 +3588,7 @@
                 <w:b w:val="0"/>
                 <w:sz w:val="24"/>
               </w:rPr>
-              <w:t xml:space="preserve">Source code: </w:t>
-            </w:r>
-            <w:r>
-              <w:rPr>
-                <w:rFonts w:ascii="Arial" w:hAnsi="Arial" w:eastAsia="Leelawadee UI" w:cs="Leelawadee UI"/>
-                <w:b w:val="0"/>
-                <w:sz w:val="24"/>
-                <w:highlight w:val="yellow"/>
-              </w:rPr>
-              <w:t>[[TODO: repository link]]</w:t>
+              <w:t>Source code: https://github.com/JingKritsada/KrengjaiBridge</w:t>
             </w:r>
           </w:p>
           <w:p>

</xml_diff>

<commit_message>
feat: LLM failover from the course endpoint to the team GPU
Ordered backends (primary course proxy, optional secondary) with cooldowns: quota/auth
errors pause a backend for 10 minutes, transient errors for 1 minute, and when all are
down the privacy steps fall back locally without waiting. Adds LM Studio support
(reasoning_effort=none) and reports backend status in /api/health.

Small local models sometimes return broken JSON, so each privacy step falls back
locally for that step only (LLMOutputError does not mark the endpoint as unavailable)
instead of failing the whole pipeline.

docs/GPU_ENDPOINT_SPEC.md specifies the team GPU host, now LM Studio over Tailscale
Funnel. The entry form and the architecture diagram show the failover chain.

Co-Authored-By: Claude Opus 5.5 <noreply@anthropic.com>
</commit_message>
<xml_diff>
--- a/docs/submission/Entry_Form_KrengjaiBridge.docx
+++ b/docs/submission/Entry_Form_KrengjaiBridge.docx
@@ -1523,7 +1523,7 @@
                 <w:b w:val="0"/>
                 <w:sz w:val="24"/>
               </w:rPr>
-              <w:t>AI agent on LINE (LINE Messaging API) with an LLM through an OpenAI-compatible API (Qwen3.5 today, Huawei Cloud ModelArts Studio MaaS DeepSeek-V4.1-Flash supported by configuration); Thai NLP (PyThaiNLP tokenization + NER, dictionary neutralization of gender/seniority particles); LLM attacker loop for author re-identification testing; k-anonymity gate and theme clustering (TF-IDF + agglomerative, LLM theme labels); FastAPI, PostgreSQL, Redis, Docker; Huawei Cloud VPC, Security Group, EIP and ECS (CN-Hong Kong); an AI-agent skill (</w:t>
+              <w:t>AI agent on LINE (LINE Messaging API) with an LLM through an OpenAI-compatible API (Qwen3.5 today with automatic failover to a self-hosted Qwen3.5 9B; Huawei Cloud ModelArts Studio MaaS DeepSeek-V4.1-Flash supported by configuration); Thai NLP (PyThaiNLP tokenization + NER, dictionary neutralization of gender/seniority particles); LLM attacker loop for author re-identification testing; k-anonymity gate and theme clustering (TF-IDF + agglomerative, LLM theme labels); FastAPI, PostgreSQL, Redis, Docker; Huawei Cloud VPC, Security Group, EIP and ECS (CN-Hong Kong); an AI-agent skill (</w:t>
             </w:r>
             <w:r>
               <w:rPr>
@@ -2370,7 +2370,7 @@
                 <w:b w:val="0"/>
                 <w:sz w:val="24"/>
               </w:rPr>
-              <w:t>The shared LLM key reached its budget during evaluation. We added an offline fallback (roster scrub + PyThaiNLP, a local stylometric attacker, rule-based structuring and themes), labelled in the UI, so the demo degrades instead of failing.</w:t>
+              <w:t>The shared LLM key reached its budget during evaluation. We added ordered failover to a team-hosted Qwen3.5 9B (LM Studio on a teammate's GPU, reached over Tailscale) and, below that, an offline fallback (roster scrub + PyThaiNLP, a local stylometric attacker, rule-based structuring and themes), labelled in the UI, so the demo degrades instead of failing.</w:t>
             </w:r>
           </w:p>
           <w:p>
@@ -2753,7 +2753,7 @@
             <w:r>
               <w:drawing>
                 <wp:inline xmlns:a="http://schemas.openxmlformats.org/drawingml/2006/main" xmlns:pic="http://schemas.openxmlformats.org/drawingml/2006/picture">
-                  <wp:extent cx="5400000" cy="2460375"/>
+                  <wp:extent cx="5400000" cy="2521125"/>
                   <wp:docPr id="1" name="Picture 1"/>
                   <wp:cNvGraphicFramePr>
                     <a:graphicFrameLocks noChangeAspect="1"/>
@@ -2774,7 +2774,7 @@
                         <pic:spPr>
                           <a:xfrm>
                             <a:off x="0" y="0"/>
-                            <a:ext cx="5400000" cy="2460375"/>
+                            <a:ext cx="5400000" cy="2521125"/>
                           </a:xfrm>
                           <a:prstGeom prst="rect"/>
                         </pic:spPr>

</xml_diff>